<commit_message>
Updated Most 2026 Report Updates
</commit_message>
<xml_diff>
--- a/Report/Background.docx
+++ b/Report/Background.docx
@@ -1,6 +1,6 @@
 
 <file path=word/document.xml><?xml version="1.0" encoding="utf-8"?>
-<w:document xmlns:wpc="http://schemas.microsoft.com/office/word/2010/wordprocessingCanvas" xmlns:cx="http://schemas.microsoft.com/office/drawing/2014/chartex" xmlns:cx1="http://schemas.microsoft.com/office/drawing/2015/9/8/chartex" xmlns:cx2="http://schemas.microsoft.com/office/drawing/2015/10/21/chartex" xmlns:cx3="http://schemas.microsoft.com/office/drawing/2016/5/9/chartex" xmlns:cx4="http://schemas.microsoft.com/office/drawing/2016/5/10/chartex" xmlns:cx5="http://schemas.microsoft.com/office/drawing/2016/5/11/chartex" xmlns:cx6="http://schemas.microsoft.com/office/drawing/2016/5/12/chartex" xmlns:cx7="http://schemas.microsoft.com/office/drawing/2016/5/13/chartex" xmlns:cx8="http://schemas.microsoft.com/office/drawing/2016/5/14/chartex" xmlns:mc="http://schemas.openxmlformats.org/markup-compatibility/2006" xmlns:aink="http://schemas.microsoft.com/office/drawing/2016/ink" xmlns:am3d="http://schemas.microsoft.com/office/drawing/2017/model3d" xmlns:o="urn:schemas-microsoft-com:office:office" xmlns:oel="http://schemas.microsoft.com/office/2019/extlst" xmlns:r="http://schemas.openxmlformats.org/officeDocument/2006/relationships" xmlns:m="http://schemas.openxmlformats.org/officeDocument/2006/math" xmlns:v="urn:schemas-microsoft-com:vml" xmlns:wp14="http://schemas.microsoft.com/office/word/2010/wordprocessingDrawing" xmlns:wp="http://schemas.openxmlformats.org/drawingml/2006/wordprocessingDrawing" xmlns:w10="urn:schemas-microsoft-com:office:word" xmlns:w="http://schemas.openxmlformats.org/wordprocessingml/2006/main" xmlns:w14="http://schemas.microsoft.com/office/word/2010/wordml" xmlns:w15="http://schemas.microsoft.com/office/word/2012/wordml" xmlns:w16cex="http://schemas.microsoft.com/office/word/2018/wordml/cex" xmlns:w16cid="http://schemas.microsoft.com/office/word/2016/wordml/cid" xmlns:w16="http://schemas.microsoft.com/office/word/2018/wordml" xmlns:w16sdtdh="http://schemas.microsoft.com/office/word/2020/wordml/sdtdatahash" xmlns:w16se="http://schemas.microsoft.com/office/word/2015/wordml/symex" xmlns:wpg="http://schemas.microsoft.com/office/word/2010/wordprocessingGroup" xmlns:wpi="http://schemas.microsoft.com/office/word/2010/wordprocessingInk" xmlns:wne="http://schemas.microsoft.com/office/word/2006/wordml" xmlns:wps="http://schemas.microsoft.com/office/word/2010/wordprocessingShape" mc:Ignorable="w14 w15 w16se w16cid w16 w16cex w16sdtdh wp14">
+<w:document xmlns:wpc="http://schemas.microsoft.com/office/word/2010/wordprocessingCanvas" xmlns:cx="http://schemas.microsoft.com/office/drawing/2014/chartex" xmlns:cx1="http://schemas.microsoft.com/office/drawing/2015/9/8/chartex" xmlns:cx2="http://schemas.microsoft.com/office/drawing/2015/10/21/chartex" xmlns:cx3="http://schemas.microsoft.com/office/drawing/2016/5/9/chartex" xmlns:cx4="http://schemas.microsoft.com/office/drawing/2016/5/10/chartex" xmlns:cx5="http://schemas.microsoft.com/office/drawing/2016/5/11/chartex" xmlns:cx6="http://schemas.microsoft.com/office/drawing/2016/5/12/chartex" xmlns:cx7="http://schemas.microsoft.com/office/drawing/2016/5/13/chartex" xmlns:cx8="http://schemas.microsoft.com/office/drawing/2016/5/14/chartex" xmlns:mc="http://schemas.openxmlformats.org/markup-compatibility/2006" xmlns:aink="http://schemas.microsoft.com/office/drawing/2016/ink" xmlns:am3d="http://schemas.microsoft.com/office/drawing/2017/model3d" xmlns:o="urn:schemas-microsoft-com:office:office" xmlns:oel="http://schemas.microsoft.com/office/2019/extlst" xmlns:r="http://schemas.openxmlformats.org/officeDocument/2006/relationships" xmlns:m="http://schemas.openxmlformats.org/officeDocument/2006/math" xmlns:v="urn:schemas-microsoft-com:vml" xmlns:wp14="http://schemas.microsoft.com/office/word/2010/wordprocessingDrawing" xmlns:wp="http://schemas.openxmlformats.org/drawingml/2006/wordprocessingDrawing" xmlns:w10="urn:schemas-microsoft-com:office:word" xmlns:w="http://schemas.openxmlformats.org/wordprocessingml/2006/main" xmlns:w14="http://schemas.microsoft.com/office/word/2010/wordml" xmlns:w15="http://schemas.microsoft.com/office/word/2012/wordml" xmlns:w16cex="http://schemas.microsoft.com/office/word/2018/wordml/cex" xmlns:w16cid="http://schemas.microsoft.com/office/word/2016/wordml/cid" xmlns:w16="http://schemas.microsoft.com/office/word/2018/wordml" xmlns:w16du="http://schemas.microsoft.com/office/word/2023/wordml/word16du" xmlns:w16sdtdh="http://schemas.microsoft.com/office/word/2020/wordml/sdtdatahash" xmlns:w16sdtfl="http://schemas.microsoft.com/office/word/2024/wordml/sdtformatlock" xmlns:w16se="http://schemas.microsoft.com/office/word/2015/wordml/symex" xmlns:wpg="http://schemas.microsoft.com/office/word/2010/wordprocessingGroup" xmlns:wpi="http://schemas.microsoft.com/office/word/2010/wordprocessingInk" xmlns:wne="http://schemas.microsoft.com/office/word/2006/wordml" xmlns:wps="http://schemas.microsoft.com/office/word/2010/wordprocessingShape" mc:Ignorable="w14 w15 w16se w16cid w16 w16cex w16sdtdh w16sdtfl w16du wp14">
   <w:body>
     <w:p>
       <w:pPr>
@@ -101,11 +101,7 @@
         </w:rPr>
       </w:pPr>
       <w:r>
-        <w:t xml:space="preserve">Plant and Office Area: ${AREA} </w:t>
-      </w:r>
-      <w:proofErr w:type="gramStart"/>
-      <w:r>
-        <w:t>ft</w:t>
+        <w:t>Plant and Office Area: ${AREA} ft</w:t>
       </w:r>
       <w:r>
         <w:rPr>
@@ -113,7 +109,6 @@
         </w:rPr>
         <w:t>2</w:t>
       </w:r>
-      <w:proofErr w:type="gramEnd"/>
     </w:p>
     <w:p>
       <w:pPr>
@@ -314,6 +309,9 @@
             <w:r>
               <w:t>Electricity</w:t>
             </w:r>
+            <w:r>
+              <w:t xml:space="preserve"> Usage</w:t>
+            </w:r>
           </w:p>
         </w:tc>
         <w:tc>
@@ -327,46 +325,13 @@
               <w:jc w:val="center"/>
             </w:pPr>
             <w:r>
-              <w:t>${</w:t>
-            </w:r>
-            <w:proofErr w:type="spellStart"/>
-            <w:r>
-              <w:t>TotalEkWh</w:t>
-            </w:r>
-            <w:proofErr w:type="spellEnd"/>
-            <w:r>
-              <w:t>} kWh or</w:t>
+              <w:t>${TotalEkWh} kWh or</w:t>
             </w:r>
             <w:r>
               <w:t xml:space="preserve"> </w:t>
             </w:r>
             <w:r>
-              <w:t>${</w:t>
-            </w:r>
-            <w:proofErr w:type="spellStart"/>
-            <w:r>
-              <w:t>TotalEBtu</w:t>
-            </w:r>
-            <w:proofErr w:type="spellEnd"/>
-            <w:r>
-              <w:t>} MMBtu</w:t>
-            </w:r>
-          </w:p>
-          <w:p>
-            <w:pPr>
-              <w:spacing w:before="120" w:after="60" w:line="360" w:lineRule="auto"/>
-              <w:jc w:val="center"/>
-            </w:pPr>
-            <w:r>
-              <w:t>${</w:t>
-            </w:r>
-            <w:proofErr w:type="spellStart"/>
-            <w:r>
-              <w:t>TotalDkW</w:t>
-            </w:r>
-            <w:proofErr w:type="spellEnd"/>
-            <w:r>
-              <w:t>} kW</w:t>
+              <w:t>${TotalEBtu} MMBtu</w:t>
             </w:r>
           </w:p>
         </w:tc>
@@ -384,15 +349,7 @@
               </w:rPr>
             </w:pPr>
             <w:r>
-              <w:t>${</w:t>
-            </w:r>
-            <w:proofErr w:type="spellStart"/>
-            <w:r>
-              <w:t>TotalECost</w:t>
-            </w:r>
-            <w:proofErr w:type="spellEnd"/>
-            <w:r>
-              <w:t xml:space="preserve">} </w:t>
+              <w:t xml:space="preserve">${TotalECost} </w:t>
             </w:r>
           </w:p>
         </w:tc>
@@ -412,15 +369,7 @@
               <w:jc w:val="center"/>
             </w:pPr>
             <w:r>
-              <w:t>${</w:t>
-            </w:r>
-            <w:proofErr w:type="spellStart"/>
-            <w:r>
-              <w:t>FuelType</w:t>
-            </w:r>
-            <w:proofErr w:type="spellEnd"/>
-            <w:r>
-              <w:t>}</w:t>
+              <w:t>Electricity Demand Usage</w:t>
             </w:r>
           </w:p>
         </w:tc>
@@ -435,15 +384,7 @@
               <w:jc w:val="center"/>
             </w:pPr>
             <w:r>
-              <w:t>${</w:t>
-            </w:r>
-            <w:proofErr w:type="spellStart"/>
-            <w:r>
-              <w:t>TotalFBtu</w:t>
-            </w:r>
-            <w:proofErr w:type="spellEnd"/>
-            <w:r>
-              <w:t>} MMBtu</w:t>
+              <w:t>${TotalDkW} kW</w:t>
             </w:r>
           </w:p>
         </w:tc>
@@ -458,15 +399,107 @@
               <w:jc w:val="center"/>
             </w:pPr>
             <w:r>
-              <w:t>${</w:t>
+              <w:t>${TotalDCost}</w:t>
             </w:r>
-            <w:proofErr w:type="spellStart"/>
+          </w:p>
+        </w:tc>
+      </w:tr>
+      <w:tr>
+        <w:trPr>
+          <w:jc w:val="center"/>
+        </w:trPr>
+        <w:tc>
+          <w:tcPr>
+            <w:tcW w:w="1728" w:type="dxa"/>
+            <w:vAlign w:val="center"/>
+          </w:tcPr>
+          <w:p>
+            <w:pPr>
+              <w:spacing w:before="120" w:after="60" w:line="360" w:lineRule="auto"/>
+              <w:jc w:val="center"/>
+            </w:pPr>
             <w:r>
-              <w:t>TotalFCost</w:t>
+              <w:t>Other Electricity Fees</w:t>
             </w:r>
-            <w:proofErr w:type="spellEnd"/>
+          </w:p>
+        </w:tc>
+        <w:tc>
+          <w:tcPr>
+            <w:tcW w:w="5184" w:type="dxa"/>
+            <w:vAlign w:val="center"/>
+          </w:tcPr>
+          <w:p>
+            <w:pPr>
+              <w:spacing w:before="120" w:after="60" w:line="360" w:lineRule="auto"/>
+              <w:jc w:val="center"/>
+            </w:pPr>
             <w:r>
-              <w:t>}</w:t>
+              <w:t>-</w:t>
+            </w:r>
+          </w:p>
+        </w:tc>
+        <w:tc>
+          <w:tcPr>
+            <w:tcW w:w="1728" w:type="dxa"/>
+            <w:vAlign w:val="center"/>
+          </w:tcPr>
+          <w:p>
+            <w:pPr>
+              <w:spacing w:before="120" w:after="60" w:line="360" w:lineRule="auto"/>
+              <w:jc w:val="center"/>
+            </w:pPr>
+            <w:r>
+              <w:t>${TotalOFees}</w:t>
+            </w:r>
+          </w:p>
+        </w:tc>
+      </w:tr>
+      <w:tr>
+        <w:trPr>
+          <w:jc w:val="center"/>
+        </w:trPr>
+        <w:tc>
+          <w:tcPr>
+            <w:tcW w:w="1728" w:type="dxa"/>
+            <w:vAlign w:val="center"/>
+          </w:tcPr>
+          <w:p>
+            <w:pPr>
+              <w:spacing w:before="120" w:after="60" w:line="360" w:lineRule="auto"/>
+              <w:jc w:val="center"/>
+            </w:pPr>
+            <w:r>
+              <w:t>${FuelType}</w:t>
+            </w:r>
+          </w:p>
+        </w:tc>
+        <w:tc>
+          <w:tcPr>
+            <w:tcW w:w="5184" w:type="dxa"/>
+            <w:vAlign w:val="center"/>
+          </w:tcPr>
+          <w:p>
+            <w:pPr>
+              <w:spacing w:before="120" w:after="60" w:line="360" w:lineRule="auto"/>
+              <w:jc w:val="center"/>
+            </w:pPr>
+            <w:r>
+              <w:t>${TotalFBtu} MMBtu</w:t>
+            </w:r>
+          </w:p>
+        </w:tc>
+        <w:tc>
+          <w:tcPr>
+            <w:tcW w:w="1728" w:type="dxa"/>
+            <w:vAlign w:val="center"/>
+          </w:tcPr>
+          <w:p>
+            <w:pPr>
+              <w:spacing w:before="120" w:after="60" w:line="360" w:lineRule="auto"/>
+              <w:jc w:val="center"/>
+            </w:pPr>
+            <w:r>
+              <w:t>${TotalFCost}</w:t>
             </w:r>
           </w:p>
         </w:tc>
@@ -513,21 +546,7 @@
               <w:rPr>
                 <w:b/>
               </w:rPr>
-              <w:t>${</w:t>
-            </w:r>
-            <w:proofErr w:type="spellStart"/>
-            <w:r>
-              <w:rPr>
-                <w:b/>
-              </w:rPr>
-              <w:t>TotalBtu</w:t>
-            </w:r>
-            <w:proofErr w:type="spellEnd"/>
-            <w:r>
-              <w:rPr>
-                <w:b/>
-              </w:rPr>
-              <w:t>} MMBtu</w:t>
+              <w:t>${TotalBtu} MMBtu</w:t>
             </w:r>
           </w:p>
         </w:tc>
@@ -548,21 +567,7 @@
               <w:rPr>
                 <w:b/>
               </w:rPr>
-              <w:t>${</w:t>
-            </w:r>
-            <w:proofErr w:type="spellStart"/>
-            <w:r>
-              <w:rPr>
-                <w:b/>
-              </w:rPr>
-              <w:t>TotalCost</w:t>
-            </w:r>
-            <w:proofErr w:type="spellEnd"/>
-            <w:r>
-              <w:rPr>
-                <w:b/>
-              </w:rPr>
-              <w:t>}</w:t>
+              <w:t>${TotalCost}</w:t>
             </w:r>
           </w:p>
         </w:tc>
@@ -579,24 +584,14 @@
       <w:r>
         <w:t xml:space="preserve">Table </w:t>
       </w:r>
-      <w:r>
-        <w:fldChar w:fldCharType="begin"/>
-      </w:r>
-      <w:r>
-        <w:instrText xml:space="preserve"> SEQ Table \* ARABIC </w:instrText>
-      </w:r>
-      <w:r>
-        <w:fldChar w:fldCharType="separate"/>
-      </w:r>
-      <w:r>
-        <w:rPr>
-          <w:noProof/>
-        </w:rPr>
-        <w:t>3</w:t>
-      </w:r>
-      <w:r>
-        <w:fldChar w:fldCharType="end"/>
-      </w:r>
+      <w:fldSimple w:instr=" SEQ Table \* ARABIC ">
+        <w:r>
+          <w:rPr>
+            <w:noProof/>
+          </w:rPr>
+          <w:t>3</w:t>
+        </w:r>
+      </w:fldSimple>
       <w:r>
         <w:t xml:space="preserve">: </w:t>
       </w:r>
@@ -628,7 +623,7 @@
 </file>
 
 <file path=word/endnotes.xml><?xml version="1.0" encoding="utf-8"?>
-<w:endnotes xmlns:wpc="http://schemas.microsoft.com/office/word/2010/wordprocessingCanvas" xmlns:cx="http://schemas.microsoft.com/office/drawing/2014/chartex" xmlns:cx1="http://schemas.microsoft.com/office/drawing/2015/9/8/chartex" xmlns:cx2="http://schemas.microsoft.com/office/drawing/2015/10/21/chartex" xmlns:cx3="http://schemas.microsoft.com/office/drawing/2016/5/9/chartex" xmlns:cx4="http://schemas.microsoft.com/office/drawing/2016/5/10/chartex" xmlns:cx5="http://schemas.microsoft.com/office/drawing/2016/5/11/chartex" xmlns:cx6="http://schemas.microsoft.com/office/drawing/2016/5/12/chartex" xmlns:cx7="http://schemas.microsoft.com/office/drawing/2016/5/13/chartex" xmlns:cx8="http://schemas.microsoft.com/office/drawing/2016/5/14/chartex" xmlns:mc="http://schemas.openxmlformats.org/markup-compatibility/2006" xmlns:aink="http://schemas.microsoft.com/office/drawing/2016/ink" xmlns:am3d="http://schemas.microsoft.com/office/drawing/2017/model3d" xmlns:o="urn:schemas-microsoft-com:office:office" xmlns:oel="http://schemas.microsoft.com/office/2019/extlst" xmlns:r="http://schemas.openxmlformats.org/officeDocument/2006/relationships" xmlns:m="http://schemas.openxmlformats.org/officeDocument/2006/math" xmlns:v="urn:schemas-microsoft-com:vml" xmlns:wp14="http://schemas.microsoft.com/office/word/2010/wordprocessingDrawing" xmlns:wp="http://schemas.openxmlformats.org/drawingml/2006/wordprocessingDrawing" xmlns:w10="urn:schemas-microsoft-com:office:word" xmlns:w="http://schemas.openxmlformats.org/wordprocessingml/2006/main" xmlns:w14="http://schemas.microsoft.com/office/word/2010/wordml" xmlns:w15="http://schemas.microsoft.com/office/word/2012/wordml" xmlns:w16cex="http://schemas.microsoft.com/office/word/2018/wordml/cex" xmlns:w16cid="http://schemas.microsoft.com/office/word/2016/wordml/cid" xmlns:w16="http://schemas.microsoft.com/office/word/2018/wordml" xmlns:w16sdtdh="http://schemas.microsoft.com/office/word/2020/wordml/sdtdatahash" xmlns:w16se="http://schemas.microsoft.com/office/word/2015/wordml/symex" xmlns:wpg="http://schemas.microsoft.com/office/word/2010/wordprocessingGroup" xmlns:wpi="http://schemas.microsoft.com/office/word/2010/wordprocessingInk" xmlns:wne="http://schemas.microsoft.com/office/word/2006/wordml" xmlns:wps="http://schemas.microsoft.com/office/word/2010/wordprocessingShape" mc:Ignorable="w14 w15 w16se w16cid w16 w16cex w16sdtdh wp14">
+<w:endnotes xmlns:wpc="http://schemas.microsoft.com/office/word/2010/wordprocessingCanvas" xmlns:cx="http://schemas.microsoft.com/office/drawing/2014/chartex" xmlns:cx1="http://schemas.microsoft.com/office/drawing/2015/9/8/chartex" xmlns:cx2="http://schemas.microsoft.com/office/drawing/2015/10/21/chartex" xmlns:cx3="http://schemas.microsoft.com/office/drawing/2016/5/9/chartex" xmlns:cx4="http://schemas.microsoft.com/office/drawing/2016/5/10/chartex" xmlns:cx5="http://schemas.microsoft.com/office/drawing/2016/5/11/chartex" xmlns:cx6="http://schemas.microsoft.com/office/drawing/2016/5/12/chartex" xmlns:cx7="http://schemas.microsoft.com/office/drawing/2016/5/13/chartex" xmlns:cx8="http://schemas.microsoft.com/office/drawing/2016/5/14/chartex" xmlns:mc="http://schemas.openxmlformats.org/markup-compatibility/2006" xmlns:aink="http://schemas.microsoft.com/office/drawing/2016/ink" xmlns:am3d="http://schemas.microsoft.com/office/drawing/2017/model3d" xmlns:o="urn:schemas-microsoft-com:office:office" xmlns:oel="http://schemas.microsoft.com/office/2019/extlst" xmlns:r="http://schemas.openxmlformats.org/officeDocument/2006/relationships" xmlns:m="http://schemas.openxmlformats.org/officeDocument/2006/math" xmlns:v="urn:schemas-microsoft-com:vml" xmlns:wp14="http://schemas.microsoft.com/office/word/2010/wordprocessingDrawing" xmlns:wp="http://schemas.openxmlformats.org/drawingml/2006/wordprocessingDrawing" xmlns:w10="urn:schemas-microsoft-com:office:word" xmlns:w="http://schemas.openxmlformats.org/wordprocessingml/2006/main" xmlns:w14="http://schemas.microsoft.com/office/word/2010/wordml" xmlns:w15="http://schemas.microsoft.com/office/word/2012/wordml" xmlns:w16cex="http://schemas.microsoft.com/office/word/2018/wordml/cex" xmlns:w16cid="http://schemas.microsoft.com/office/word/2016/wordml/cid" xmlns:w16="http://schemas.microsoft.com/office/word/2018/wordml" xmlns:w16du="http://schemas.microsoft.com/office/word/2023/wordml/word16du" xmlns:w16sdtdh="http://schemas.microsoft.com/office/word/2020/wordml/sdtdatahash" xmlns:w16sdtfl="http://schemas.microsoft.com/office/word/2024/wordml/sdtformatlock" xmlns:w16se="http://schemas.microsoft.com/office/word/2015/wordml/symex" xmlns:wpg="http://schemas.microsoft.com/office/word/2010/wordprocessingGroup" xmlns:wpi="http://schemas.microsoft.com/office/word/2010/wordprocessingInk" xmlns:wne="http://schemas.microsoft.com/office/word/2006/wordml" xmlns:wps="http://schemas.microsoft.com/office/word/2010/wordprocessingShape" mc:Ignorable="w14 w15 w16se w16cid w16 w16cex w16sdtdh w16sdtfl w16du wp14">
   <w:endnote w:type="separator" w:id="-1">
     <w:p>
       <w:r>
@@ -647,7 +642,7 @@
 </file>
 
 <file path=word/footer1.xml><?xml version="1.0" encoding="utf-8"?>
-<w:ftr xmlns:wpc="http://schemas.microsoft.com/office/word/2010/wordprocessingCanvas" xmlns:cx="http://schemas.microsoft.com/office/drawing/2014/chartex" xmlns:cx1="http://schemas.microsoft.com/office/drawing/2015/9/8/chartex" xmlns:cx2="http://schemas.microsoft.com/office/drawing/2015/10/21/chartex" xmlns:cx3="http://schemas.microsoft.com/office/drawing/2016/5/9/chartex" xmlns:cx4="http://schemas.microsoft.com/office/drawing/2016/5/10/chartex" xmlns:cx5="http://schemas.microsoft.com/office/drawing/2016/5/11/chartex" xmlns:cx6="http://schemas.microsoft.com/office/drawing/2016/5/12/chartex" xmlns:cx7="http://schemas.microsoft.com/office/drawing/2016/5/13/chartex" xmlns:cx8="http://schemas.microsoft.com/office/drawing/2016/5/14/chartex" xmlns:mc="http://schemas.openxmlformats.org/markup-compatibility/2006" xmlns:aink="http://schemas.microsoft.com/office/drawing/2016/ink" xmlns:am3d="http://schemas.microsoft.com/office/drawing/2017/model3d" xmlns:o="urn:schemas-microsoft-com:office:office" xmlns:oel="http://schemas.microsoft.com/office/2019/extlst" xmlns:r="http://schemas.openxmlformats.org/officeDocument/2006/relationships" xmlns:m="http://schemas.openxmlformats.org/officeDocument/2006/math" xmlns:v="urn:schemas-microsoft-com:vml" xmlns:wp14="http://schemas.microsoft.com/office/word/2010/wordprocessingDrawing" xmlns:wp="http://schemas.openxmlformats.org/drawingml/2006/wordprocessingDrawing" xmlns:w10="urn:schemas-microsoft-com:office:word" xmlns:w="http://schemas.openxmlformats.org/wordprocessingml/2006/main" xmlns:w14="http://schemas.microsoft.com/office/word/2010/wordml" xmlns:w15="http://schemas.microsoft.com/office/word/2012/wordml" xmlns:w16cex="http://schemas.microsoft.com/office/word/2018/wordml/cex" xmlns:w16cid="http://schemas.microsoft.com/office/word/2016/wordml/cid" xmlns:w16="http://schemas.microsoft.com/office/word/2018/wordml" xmlns:w16sdtdh="http://schemas.microsoft.com/office/word/2020/wordml/sdtdatahash" xmlns:w16se="http://schemas.microsoft.com/office/word/2015/wordml/symex" xmlns:wpg="http://schemas.microsoft.com/office/word/2010/wordprocessingGroup" xmlns:wpi="http://schemas.microsoft.com/office/word/2010/wordprocessingInk" xmlns:wne="http://schemas.microsoft.com/office/word/2006/wordml" xmlns:wps="http://schemas.microsoft.com/office/word/2010/wordprocessingShape" mc:Ignorable="w14 w15 w16se w16cid w16 w16cex w16sdtdh wp14">
+<w:ftr xmlns:wpc="http://schemas.microsoft.com/office/word/2010/wordprocessingCanvas" xmlns:cx="http://schemas.microsoft.com/office/drawing/2014/chartex" xmlns:cx1="http://schemas.microsoft.com/office/drawing/2015/9/8/chartex" xmlns:cx2="http://schemas.microsoft.com/office/drawing/2015/10/21/chartex" xmlns:cx3="http://schemas.microsoft.com/office/drawing/2016/5/9/chartex" xmlns:cx4="http://schemas.microsoft.com/office/drawing/2016/5/10/chartex" xmlns:cx5="http://schemas.microsoft.com/office/drawing/2016/5/11/chartex" xmlns:cx6="http://schemas.microsoft.com/office/drawing/2016/5/12/chartex" xmlns:cx7="http://schemas.microsoft.com/office/drawing/2016/5/13/chartex" xmlns:cx8="http://schemas.microsoft.com/office/drawing/2016/5/14/chartex" xmlns:mc="http://schemas.openxmlformats.org/markup-compatibility/2006" xmlns:aink="http://schemas.microsoft.com/office/drawing/2016/ink" xmlns:am3d="http://schemas.microsoft.com/office/drawing/2017/model3d" xmlns:o="urn:schemas-microsoft-com:office:office" xmlns:oel="http://schemas.microsoft.com/office/2019/extlst" xmlns:r="http://schemas.openxmlformats.org/officeDocument/2006/relationships" xmlns:m="http://schemas.openxmlformats.org/officeDocument/2006/math" xmlns:v="urn:schemas-microsoft-com:vml" xmlns:wp14="http://schemas.microsoft.com/office/word/2010/wordprocessingDrawing" xmlns:wp="http://schemas.openxmlformats.org/drawingml/2006/wordprocessingDrawing" xmlns:w10="urn:schemas-microsoft-com:office:word" xmlns:w="http://schemas.openxmlformats.org/wordprocessingml/2006/main" xmlns:w14="http://schemas.microsoft.com/office/word/2010/wordml" xmlns:w15="http://schemas.microsoft.com/office/word/2012/wordml" xmlns:w16cex="http://schemas.microsoft.com/office/word/2018/wordml/cex" xmlns:w16cid="http://schemas.microsoft.com/office/word/2016/wordml/cid" xmlns:w16="http://schemas.microsoft.com/office/word/2018/wordml" xmlns:w16du="http://schemas.microsoft.com/office/word/2023/wordml/word16du" xmlns:w16sdtdh="http://schemas.microsoft.com/office/word/2020/wordml/sdtdatahash" xmlns:w16sdtfl="http://schemas.microsoft.com/office/word/2024/wordml/sdtformatlock" xmlns:w16se="http://schemas.microsoft.com/office/word/2015/wordml/symex" xmlns:wpg="http://schemas.microsoft.com/office/word/2010/wordprocessingGroup" xmlns:wpi="http://schemas.microsoft.com/office/word/2010/wordprocessingInk" xmlns:wne="http://schemas.microsoft.com/office/word/2006/wordml" xmlns:wps="http://schemas.microsoft.com/office/word/2010/wordprocessingShape" mc:Ignorable="w14 w15 w16se w16cid w16 w16cex w16sdtdh w16sdtfl w16du wp14">
   <w:p>
     <w:pPr>
       <w:pBdr>
@@ -728,7 +723,7 @@
 </file>
 
 <file path=word/footnotes.xml><?xml version="1.0" encoding="utf-8"?>
-<w:footnotes xmlns:wpc="http://schemas.microsoft.com/office/word/2010/wordprocessingCanvas" xmlns:cx="http://schemas.microsoft.com/office/drawing/2014/chartex" xmlns:cx1="http://schemas.microsoft.com/office/drawing/2015/9/8/chartex" xmlns:cx2="http://schemas.microsoft.com/office/drawing/2015/10/21/chartex" xmlns:cx3="http://schemas.microsoft.com/office/drawing/2016/5/9/chartex" xmlns:cx4="http://schemas.microsoft.com/office/drawing/2016/5/10/chartex" xmlns:cx5="http://schemas.microsoft.com/office/drawing/2016/5/11/chartex" xmlns:cx6="http://schemas.microsoft.com/office/drawing/2016/5/12/chartex" xmlns:cx7="http://schemas.microsoft.com/office/drawing/2016/5/13/chartex" xmlns:cx8="http://schemas.microsoft.com/office/drawing/2016/5/14/chartex" xmlns:mc="http://schemas.openxmlformats.org/markup-compatibility/2006" xmlns:aink="http://schemas.microsoft.com/office/drawing/2016/ink" xmlns:am3d="http://schemas.microsoft.com/office/drawing/2017/model3d" xmlns:o="urn:schemas-microsoft-com:office:office" xmlns:oel="http://schemas.microsoft.com/office/2019/extlst" xmlns:r="http://schemas.openxmlformats.org/officeDocument/2006/relationships" xmlns:m="http://schemas.openxmlformats.org/officeDocument/2006/math" xmlns:v="urn:schemas-microsoft-com:vml" xmlns:wp14="http://schemas.microsoft.com/office/word/2010/wordprocessingDrawing" xmlns:wp="http://schemas.openxmlformats.org/drawingml/2006/wordprocessingDrawing" xmlns:w10="urn:schemas-microsoft-com:office:word" xmlns:w="http://schemas.openxmlformats.org/wordprocessingml/2006/main" xmlns:w14="http://schemas.microsoft.com/office/word/2010/wordml" xmlns:w15="http://schemas.microsoft.com/office/word/2012/wordml" xmlns:w16cex="http://schemas.microsoft.com/office/word/2018/wordml/cex" xmlns:w16cid="http://schemas.microsoft.com/office/word/2016/wordml/cid" xmlns:w16="http://schemas.microsoft.com/office/word/2018/wordml" xmlns:w16sdtdh="http://schemas.microsoft.com/office/word/2020/wordml/sdtdatahash" xmlns:w16se="http://schemas.microsoft.com/office/word/2015/wordml/symex" xmlns:wpg="http://schemas.microsoft.com/office/word/2010/wordprocessingGroup" xmlns:wpi="http://schemas.microsoft.com/office/word/2010/wordprocessingInk" xmlns:wne="http://schemas.microsoft.com/office/word/2006/wordml" xmlns:wps="http://schemas.microsoft.com/office/word/2010/wordprocessingShape" mc:Ignorable="w14 w15 w16se w16cid w16 w16cex w16sdtdh wp14">
+<w:footnotes xmlns:wpc="http://schemas.microsoft.com/office/word/2010/wordprocessingCanvas" xmlns:cx="http://schemas.microsoft.com/office/drawing/2014/chartex" xmlns:cx1="http://schemas.microsoft.com/office/drawing/2015/9/8/chartex" xmlns:cx2="http://schemas.microsoft.com/office/drawing/2015/10/21/chartex" xmlns:cx3="http://schemas.microsoft.com/office/drawing/2016/5/9/chartex" xmlns:cx4="http://schemas.microsoft.com/office/drawing/2016/5/10/chartex" xmlns:cx5="http://schemas.microsoft.com/office/drawing/2016/5/11/chartex" xmlns:cx6="http://schemas.microsoft.com/office/drawing/2016/5/12/chartex" xmlns:cx7="http://schemas.microsoft.com/office/drawing/2016/5/13/chartex" xmlns:cx8="http://schemas.microsoft.com/office/drawing/2016/5/14/chartex" xmlns:mc="http://schemas.openxmlformats.org/markup-compatibility/2006" xmlns:aink="http://schemas.microsoft.com/office/drawing/2016/ink" xmlns:am3d="http://schemas.microsoft.com/office/drawing/2017/model3d" xmlns:o="urn:schemas-microsoft-com:office:office" xmlns:oel="http://schemas.microsoft.com/office/2019/extlst" xmlns:r="http://schemas.openxmlformats.org/officeDocument/2006/relationships" xmlns:m="http://schemas.openxmlformats.org/officeDocument/2006/math" xmlns:v="urn:schemas-microsoft-com:vml" xmlns:wp14="http://schemas.microsoft.com/office/word/2010/wordprocessingDrawing" xmlns:wp="http://schemas.openxmlformats.org/drawingml/2006/wordprocessingDrawing" xmlns:w10="urn:schemas-microsoft-com:office:word" xmlns:w="http://schemas.openxmlformats.org/wordprocessingml/2006/main" xmlns:w14="http://schemas.microsoft.com/office/word/2010/wordml" xmlns:w15="http://schemas.microsoft.com/office/word/2012/wordml" xmlns:w16cex="http://schemas.microsoft.com/office/word/2018/wordml/cex" xmlns:w16cid="http://schemas.microsoft.com/office/word/2016/wordml/cid" xmlns:w16="http://schemas.microsoft.com/office/word/2018/wordml" xmlns:w16du="http://schemas.microsoft.com/office/word/2023/wordml/word16du" xmlns:w16sdtdh="http://schemas.microsoft.com/office/word/2020/wordml/sdtdatahash" xmlns:w16sdtfl="http://schemas.microsoft.com/office/word/2024/wordml/sdtformatlock" xmlns:w16se="http://schemas.microsoft.com/office/word/2015/wordml/symex" xmlns:wpg="http://schemas.microsoft.com/office/word/2010/wordprocessingGroup" xmlns:wpi="http://schemas.microsoft.com/office/word/2010/wordprocessingInk" xmlns:wne="http://schemas.microsoft.com/office/word/2006/wordml" xmlns:wps="http://schemas.microsoft.com/office/word/2010/wordprocessingShape" mc:Ignorable="w14 w15 w16se w16cid w16 w16cex w16sdtdh w16sdtfl w16du wp14">
   <w:footnote w:type="separator" w:id="-1">
     <w:p>
       <w:r>
@@ -747,7 +742,7 @@
 </file>
 
 <file path=word/numbering.xml><?xml version="1.0" encoding="utf-8"?>
-<w:numbering xmlns:wpc="http://schemas.microsoft.com/office/word/2010/wordprocessingCanvas" xmlns:cx="http://schemas.microsoft.com/office/drawing/2014/chartex" xmlns:cx1="http://schemas.microsoft.com/office/drawing/2015/9/8/chartex" xmlns:cx2="http://schemas.microsoft.com/office/drawing/2015/10/21/chartex" xmlns:cx3="http://schemas.microsoft.com/office/drawing/2016/5/9/chartex" xmlns:cx4="http://schemas.microsoft.com/office/drawing/2016/5/10/chartex" xmlns:cx5="http://schemas.microsoft.com/office/drawing/2016/5/11/chartex" xmlns:cx6="http://schemas.microsoft.com/office/drawing/2016/5/12/chartex" xmlns:cx7="http://schemas.microsoft.com/office/drawing/2016/5/13/chartex" xmlns:cx8="http://schemas.microsoft.com/office/drawing/2016/5/14/chartex" xmlns:mc="http://schemas.openxmlformats.org/markup-compatibility/2006" xmlns:aink="http://schemas.microsoft.com/office/drawing/2016/ink" xmlns:am3d="http://schemas.microsoft.com/office/drawing/2017/model3d" xmlns:o="urn:schemas-microsoft-com:office:office" xmlns:oel="http://schemas.microsoft.com/office/2019/extlst" xmlns:r="http://schemas.openxmlformats.org/officeDocument/2006/relationships" xmlns:m="http://schemas.openxmlformats.org/officeDocument/2006/math" xmlns:v="urn:schemas-microsoft-com:vml" xmlns:wp14="http://schemas.microsoft.com/office/word/2010/wordprocessingDrawing" xmlns:wp="http://schemas.openxmlformats.org/drawingml/2006/wordprocessingDrawing" xmlns:w10="urn:schemas-microsoft-com:office:word" xmlns:w="http://schemas.openxmlformats.org/wordprocessingml/2006/main" xmlns:w14="http://schemas.microsoft.com/office/word/2010/wordml" xmlns:w15="http://schemas.microsoft.com/office/word/2012/wordml" xmlns:w16cex="http://schemas.microsoft.com/office/word/2018/wordml/cex" xmlns:w16cid="http://schemas.microsoft.com/office/word/2016/wordml/cid" xmlns:w16="http://schemas.microsoft.com/office/word/2018/wordml" xmlns:w16sdtdh="http://schemas.microsoft.com/office/word/2020/wordml/sdtdatahash" xmlns:w16se="http://schemas.microsoft.com/office/word/2015/wordml/symex" xmlns:wpg="http://schemas.microsoft.com/office/word/2010/wordprocessingGroup" xmlns:wpi="http://schemas.microsoft.com/office/word/2010/wordprocessingInk" xmlns:wne="http://schemas.microsoft.com/office/word/2006/wordml" xmlns:wps="http://schemas.microsoft.com/office/word/2010/wordprocessingShape" mc:Ignorable="w14 w15 w16se w16cid w16 w16cex w16sdtdh wp14">
+<w:numbering xmlns:wpc="http://schemas.microsoft.com/office/word/2010/wordprocessingCanvas" xmlns:cx="http://schemas.microsoft.com/office/drawing/2014/chartex" xmlns:cx1="http://schemas.microsoft.com/office/drawing/2015/9/8/chartex" xmlns:cx2="http://schemas.microsoft.com/office/drawing/2015/10/21/chartex" xmlns:cx3="http://schemas.microsoft.com/office/drawing/2016/5/9/chartex" xmlns:cx4="http://schemas.microsoft.com/office/drawing/2016/5/10/chartex" xmlns:cx5="http://schemas.microsoft.com/office/drawing/2016/5/11/chartex" xmlns:cx6="http://schemas.microsoft.com/office/drawing/2016/5/12/chartex" xmlns:cx7="http://schemas.microsoft.com/office/drawing/2016/5/13/chartex" xmlns:cx8="http://schemas.microsoft.com/office/drawing/2016/5/14/chartex" xmlns:mc="http://schemas.openxmlformats.org/markup-compatibility/2006" xmlns:aink="http://schemas.microsoft.com/office/drawing/2016/ink" xmlns:am3d="http://schemas.microsoft.com/office/drawing/2017/model3d" xmlns:o="urn:schemas-microsoft-com:office:office" xmlns:oel="http://schemas.microsoft.com/office/2019/extlst" xmlns:r="http://schemas.openxmlformats.org/officeDocument/2006/relationships" xmlns:m="http://schemas.openxmlformats.org/officeDocument/2006/math" xmlns:v="urn:schemas-microsoft-com:vml" xmlns:wp14="http://schemas.microsoft.com/office/word/2010/wordprocessingDrawing" xmlns:wp="http://schemas.openxmlformats.org/drawingml/2006/wordprocessingDrawing" xmlns:w10="urn:schemas-microsoft-com:office:word" xmlns:w="http://schemas.openxmlformats.org/wordprocessingml/2006/main" xmlns:w14="http://schemas.microsoft.com/office/word/2010/wordml" xmlns:w15="http://schemas.microsoft.com/office/word/2012/wordml" xmlns:w16cex="http://schemas.microsoft.com/office/word/2018/wordml/cex" xmlns:w16cid="http://schemas.microsoft.com/office/word/2016/wordml/cid" xmlns:w16="http://schemas.microsoft.com/office/word/2018/wordml" xmlns:w16du="http://schemas.microsoft.com/office/word/2023/wordml/word16du" xmlns:w16sdtdh="http://schemas.microsoft.com/office/word/2020/wordml/sdtdatahash" xmlns:w16sdtfl="http://schemas.microsoft.com/office/word/2024/wordml/sdtformatlock" xmlns:w16se="http://schemas.microsoft.com/office/word/2015/wordml/symex" xmlns:wpg="http://schemas.microsoft.com/office/word/2010/wordprocessingGroup" xmlns:wpi="http://schemas.microsoft.com/office/word/2010/wordprocessingInk" xmlns:wne="http://schemas.microsoft.com/office/word/2006/wordml" xmlns:wps="http://schemas.microsoft.com/office/word/2010/wordprocessingShape" mc:Ignorable="w14 w15 w16se w16cid w16 w16cex w16sdtdh w16sdtfl w16du wp14">
   <w:abstractNum w:abstractNumId="0" w15:restartNumberingAfterBreak="0">
     <w:nsid w:val="06245008"/>
     <w:multiLevelType w:val="multilevel"/>
@@ -2842,11 +2837,11 @@
 </file>
 
 <file path=word/styles.xml><?xml version="1.0" encoding="utf-8"?>
-<w:styles xmlns:mc="http://schemas.openxmlformats.org/markup-compatibility/2006" xmlns:r="http://schemas.openxmlformats.org/officeDocument/2006/relationships" xmlns:w="http://schemas.openxmlformats.org/wordprocessingml/2006/main" xmlns:w14="http://schemas.microsoft.com/office/word/2010/wordml" xmlns:w15="http://schemas.microsoft.com/office/word/2012/wordml" xmlns:w16cex="http://schemas.microsoft.com/office/word/2018/wordml/cex" xmlns:w16cid="http://schemas.microsoft.com/office/word/2016/wordml/cid" xmlns:w16="http://schemas.microsoft.com/office/word/2018/wordml" xmlns:w16sdtdh="http://schemas.microsoft.com/office/word/2020/wordml/sdtdatahash" xmlns:w16se="http://schemas.microsoft.com/office/word/2015/wordml/symex" mc:Ignorable="w14 w15 w16se w16cid w16 w16cex w16sdtdh">
+<w:styles xmlns:mc="http://schemas.openxmlformats.org/markup-compatibility/2006" xmlns:r="http://schemas.openxmlformats.org/officeDocument/2006/relationships" xmlns:w="http://schemas.openxmlformats.org/wordprocessingml/2006/main" xmlns:w14="http://schemas.microsoft.com/office/word/2010/wordml" xmlns:w15="http://schemas.microsoft.com/office/word/2012/wordml" xmlns:w16cex="http://schemas.microsoft.com/office/word/2018/wordml/cex" xmlns:w16cid="http://schemas.microsoft.com/office/word/2016/wordml/cid" xmlns:w16="http://schemas.microsoft.com/office/word/2018/wordml" xmlns:w16du="http://schemas.microsoft.com/office/word/2023/wordml/word16du" xmlns:w16sdtdh="http://schemas.microsoft.com/office/word/2020/wordml/sdtdatahash" xmlns:w16sdtfl="http://schemas.microsoft.com/office/word/2024/wordml/sdtformatlock" xmlns:w16se="http://schemas.microsoft.com/office/word/2015/wordml/symex" mc:Ignorable="w14 w15 w16se w16cid w16 w16cex w16sdtdh w16sdtfl w16du">
   <w:docDefaults>
     <w:rPrDefault>
       <w:rPr>
-        <w:rFonts w:ascii="Times New Roman" w:eastAsia="宋体" w:hAnsi="Times New Roman" w:cs="Times New Roman"/>
+        <w:rFonts w:ascii="Times New Roman" w:eastAsia="SimSun" w:hAnsi="Times New Roman" w:cs="Times New Roman"/>
         <w:sz w:val="24"/>
         <w:szCs w:val="24"/>
         <w:lang w:val="en-US" w:eastAsia="zh-CN" w:bidi="ar-SA"/>

</xml_diff>